<commit_message>
Update GST contract template to newly uploaded Form_GST.docx
</commit_message>
<xml_diff>
--- a/Form_GST.docx
+++ b/Form_GST.docx
@@ -79,7 +79,6 @@
         <w:rPr>
           <w:sz w:val="22"/>
           <w:szCs w:val="22"/>
-          <w:highlight w:val="yellow"/>
         </w:rPr>
         <w:t>DATE</w:t>
       </w:r>
@@ -115,7 +114,6 @@
         <w:rPr>
           <w:sz w:val="22"/>
           <w:szCs w:val="22"/>
-          <w:highlight w:val="yellow"/>
         </w:rPr>
         <w:t>OWNER_NAME</w:t>
       </w:r>
@@ -130,7 +128,6 @@
         <w:rPr>
           <w:sz w:val="21"/>
           <w:szCs w:val="21"/>
-          <w:highlight w:val="yellow"/>
         </w:rPr>
         <w:t>TRADE_NAME</w:t>
       </w:r>
@@ -152,7 +149,6 @@
         <w:rPr>
           <w:sz w:val="22"/>
           <w:szCs w:val="22"/>
-          <w:highlight w:val="yellow"/>
         </w:rPr>
         <w:t>OWNER_NAME</w:t>
       </w:r>
@@ -167,7 +163,6 @@
         <w:rPr>
           <w:sz w:val="22"/>
           <w:szCs w:val="22"/>
-          <w:highlight w:val="yellow"/>
         </w:rPr>
         <w:t>GST_NO</w:t>
       </w:r>
@@ -183,7 +178,6 @@
         <w:rPr>
           <w:sz w:val="22"/>
           <w:szCs w:val="22"/>
-          <w:highlight w:val="yellow"/>
         </w:rPr>
         <w:t>GST_ADDRESS</w:t>
       </w:r>
@@ -200,7 +194,14 @@
           <w:sz w:val="22"/>
           <w:szCs w:val="22"/>
         </w:rPr>
-        <w:t>(Hereinafter referred to as “Franchisee” which term shall so far as the context admits be deemed to mean and include its successors and permitted assigns) of the First Part</w:t>
+        <w:t>(Hereinafter referred to as “Franchisee” which term shall so</w:t>
+      </w:r>
+      <w:r>
+        <w:rPr>
+          <w:sz w:val="22"/>
+          <w:szCs w:val="22"/>
+        </w:rPr>
+        <w:t xml:space="preserve"> far as the context admits be deemed to mean and include its successors and permitted assigns) of the First Part</w:t>
       </w:r>
       <w:r>
         <w:rPr>
@@ -3362,14 +3363,12 @@
         <w:rPr>
           <w:sz w:val="22"/>
           <w:szCs w:val="22"/>
-          <w:highlight w:val="yellow"/>
-        </w:rPr>
-      </w:pPr>
-      <w:r>
-        <w:rPr>
-          <w:sz w:val="22"/>
-          <w:szCs w:val="22"/>
-          <w:highlight w:val="yellow"/>
+        </w:rPr>
+      </w:pPr>
+      <w:r>
+        <w:rPr>
+          <w:sz w:val="22"/>
+          <w:szCs w:val="22"/>
         </w:rPr>
         <w:t xml:space="preserve">Reseller </w:t>
       </w:r>
@@ -3378,7 +3377,6 @@
         <w:rPr>
           <w:sz w:val="22"/>
           <w:szCs w:val="22"/>
-          <w:highlight w:val="yellow"/>
         </w:rPr>
         <w:t>margin  =</w:t>
       </w:r>
@@ -3387,7 +3385,6 @@
         <w:rPr>
           <w:sz w:val="22"/>
           <w:szCs w:val="22"/>
-          <w:highlight w:val="yellow"/>
         </w:rPr>
         <w:t xml:space="preserve"> Reseller margin % * Net Booking Value</w:t>
       </w:r>
@@ -3400,26 +3397,23 @@
         <w:rPr>
           <w:sz w:val="22"/>
           <w:szCs w:val="22"/>
-          <w:highlight w:val="yellow"/>
-        </w:rPr>
-      </w:pPr>
-    </w:p>
-    <w:p>
-      <w:pPr>
-        <w:pStyle w:val="ListParagraph"/>
-        <w:spacing w:line="200" w:lineRule="atLeast"/>
-        <w:jc w:val="both"/>
-        <w:rPr>
-          <w:sz w:val="22"/>
-          <w:szCs w:val="22"/>
-          <w:highlight w:val="yellow"/>
-        </w:rPr>
-      </w:pPr>
-      <w:r>
-        <w:rPr>
-          <w:sz w:val="22"/>
-          <w:szCs w:val="22"/>
-          <w:highlight w:val="yellow"/>
+        </w:rPr>
+      </w:pPr>
+    </w:p>
+    <w:p>
+      <w:pPr>
+        <w:pStyle w:val="ListParagraph"/>
+        <w:spacing w:line="200" w:lineRule="atLeast"/>
+        <w:jc w:val="both"/>
+        <w:rPr>
+          <w:sz w:val="22"/>
+          <w:szCs w:val="22"/>
+        </w:rPr>
+      </w:pPr>
+      <w:r>
+        <w:rPr>
+          <w:sz w:val="22"/>
+          <w:szCs w:val="22"/>
         </w:rPr>
         <w:t xml:space="preserve">Reseller </w:t>
       </w:r>
@@ -3428,7 +3422,6 @@
         <w:rPr>
           <w:sz w:val="22"/>
           <w:szCs w:val="22"/>
-          <w:highlight w:val="yellow"/>
         </w:rPr>
         <w:t>margin  on</w:t>
       </w:r>
@@ -3437,7 +3430,6 @@
         <w:rPr>
           <w:sz w:val="22"/>
           <w:szCs w:val="22"/>
-          <w:highlight w:val="yellow"/>
         </w:rPr>
         <w:t xml:space="preserve"> Franchisor Bookings =</w:t>
       </w:r>
@@ -3445,7 +3437,6 @@
         <w:rPr>
           <w:sz w:val="22"/>
           <w:szCs w:val="22"/>
-          <w:highlight w:val="yellow"/>
         </w:rPr>
         <w:t xml:space="preserve"> </w:t>
       </w:r>
@@ -3453,7 +3444,6 @@
         <w:rPr>
           <w:sz w:val="22"/>
           <w:szCs w:val="22"/>
-          <w:highlight w:val="yellow"/>
         </w:rPr>
         <w:t>2</w:t>
       </w:r>
@@ -3461,7 +3451,6 @@
         <w:rPr>
           <w:sz w:val="22"/>
           <w:szCs w:val="22"/>
-          <w:highlight w:val="yellow"/>
         </w:rPr>
         <w:t>5</w:t>
       </w:r>
@@ -3469,7 +3458,6 @@
         <w:rPr>
           <w:sz w:val="22"/>
           <w:szCs w:val="22"/>
-          <w:highlight w:val="yellow"/>
         </w:rPr>
         <w:t>%</w:t>
       </w:r>
@@ -3481,26 +3469,23 @@
         <w:rPr>
           <w:sz w:val="22"/>
           <w:szCs w:val="22"/>
-          <w:highlight w:val="yellow"/>
-        </w:rPr>
-      </w:pPr>
-    </w:p>
-    <w:p>
-      <w:pPr>
-        <w:pStyle w:val="ListParagraph"/>
-        <w:spacing w:line="200" w:lineRule="atLeast"/>
-        <w:jc w:val="both"/>
-        <w:rPr>
-          <w:sz w:val="22"/>
-          <w:szCs w:val="22"/>
-          <w:highlight w:val="yellow"/>
-        </w:rPr>
-      </w:pPr>
-      <w:r>
-        <w:rPr>
-          <w:sz w:val="22"/>
-          <w:szCs w:val="22"/>
-          <w:highlight w:val="yellow"/>
+        </w:rPr>
+      </w:pPr>
+    </w:p>
+    <w:p>
+      <w:pPr>
+        <w:pStyle w:val="ListParagraph"/>
+        <w:spacing w:line="200" w:lineRule="atLeast"/>
+        <w:jc w:val="both"/>
+        <w:rPr>
+          <w:sz w:val="22"/>
+          <w:szCs w:val="22"/>
+        </w:rPr>
+      </w:pPr>
+      <w:r>
+        <w:rPr>
+          <w:sz w:val="22"/>
+          <w:szCs w:val="22"/>
         </w:rPr>
         <w:t>Reseller margin on Franchisee Bookings</w:t>
       </w:r>
@@ -3508,7 +3493,6 @@
         <w:rPr>
           <w:sz w:val="22"/>
           <w:szCs w:val="22"/>
-          <w:highlight w:val="yellow"/>
         </w:rPr>
         <w:t xml:space="preserve">= </w:t>
       </w:r>
@@ -3516,7 +3500,6 @@
         <w:rPr>
           <w:sz w:val="22"/>
           <w:szCs w:val="22"/>
-          <w:highlight w:val="yellow"/>
         </w:rPr>
         <w:t>0</w:t>
       </w:r>
@@ -3524,7 +3507,6 @@
         <w:rPr>
           <w:sz w:val="22"/>
           <w:szCs w:val="22"/>
-          <w:highlight w:val="yellow"/>
         </w:rPr>
         <w:t>%</w:t>
       </w:r>
@@ -3532,7 +3514,6 @@
         <w:rPr>
           <w:sz w:val="22"/>
           <w:szCs w:val="22"/>
-          <w:highlight w:val="yellow"/>
         </w:rPr>
         <w:t xml:space="preserve"> </w:t>
       </w:r>
@@ -3545,26 +3526,23 @@
         <w:rPr>
           <w:sz w:val="22"/>
           <w:szCs w:val="22"/>
-          <w:highlight w:val="yellow"/>
-        </w:rPr>
-      </w:pPr>
-    </w:p>
-    <w:p>
-      <w:pPr>
-        <w:pStyle w:val="ListParagraph"/>
-        <w:spacing w:line="200" w:lineRule="atLeast"/>
-        <w:jc w:val="both"/>
-        <w:rPr>
-          <w:sz w:val="22"/>
-          <w:szCs w:val="22"/>
-          <w:highlight w:val="yellow"/>
-        </w:rPr>
-      </w:pPr>
-      <w:r>
-        <w:rPr>
-          <w:sz w:val="22"/>
-          <w:szCs w:val="22"/>
-          <w:highlight w:val="yellow"/>
+        </w:rPr>
+      </w:pPr>
+    </w:p>
+    <w:p>
+      <w:pPr>
+        <w:pStyle w:val="ListParagraph"/>
+        <w:spacing w:line="200" w:lineRule="atLeast"/>
+        <w:jc w:val="both"/>
+        <w:rPr>
+          <w:sz w:val="22"/>
+          <w:szCs w:val="22"/>
+        </w:rPr>
+      </w:pPr>
+      <w:r>
+        <w:rPr>
+          <w:sz w:val="22"/>
+          <w:szCs w:val="22"/>
         </w:rPr>
         <w:t>Platform fees:</w:t>
       </w:r>
@@ -3577,7 +3555,6 @@
         <w:rPr>
           <w:sz w:val="22"/>
           <w:szCs w:val="22"/>
-          <w:highlight w:val="yellow"/>
         </w:rPr>
       </w:pPr>
     </w:p>
@@ -3607,14 +3584,12 @@
               <w:rPr>
                 <w:sz w:val="22"/>
                 <w:szCs w:val="22"/>
-                <w:highlight w:val="yellow"/>
               </w:rPr>
             </w:pPr>
             <w:r>
               <w:rPr>
                 <w:sz w:val="22"/>
                 <w:szCs w:val="22"/>
-                <w:highlight w:val="yellow"/>
               </w:rPr>
               <w:t>Franchisor's Booking</w:t>
             </w:r>
@@ -3628,14 +3603,12 @@
               <w:rPr>
                 <w:sz w:val="22"/>
                 <w:szCs w:val="22"/>
-                <w:highlight w:val="yellow"/>
               </w:rPr>
             </w:pPr>
             <w:r>
               <w:rPr>
                 <w:sz w:val="22"/>
                 <w:szCs w:val="22"/>
-                <w:highlight w:val="yellow"/>
               </w:rPr>
               <w:t>Occupancy (%)</w:t>
             </w:r>
@@ -3654,14 +3627,12 @@
               <w:rPr>
                 <w:sz w:val="22"/>
                 <w:szCs w:val="22"/>
-                <w:highlight w:val="yellow"/>
               </w:rPr>
             </w:pPr>
             <w:r>
               <w:rPr>
                 <w:sz w:val="22"/>
                 <w:szCs w:val="22"/>
-                <w:highlight w:val="yellow"/>
               </w:rPr>
               <w:t>Platform fees</w:t>
             </w:r>
@@ -3685,14 +3656,12 @@
               <w:rPr>
                 <w:sz w:val="22"/>
                 <w:szCs w:val="22"/>
-                <w:highlight w:val="yellow"/>
               </w:rPr>
             </w:pPr>
             <w:r>
               <w:rPr>
                 <w:sz w:val="22"/>
                 <w:szCs w:val="22"/>
-                <w:highlight w:val="yellow"/>
               </w:rPr>
               <w:t>0-29%</w:t>
             </w:r>
@@ -3711,14 +3680,12 @@
               <w:rPr>
                 <w:sz w:val="22"/>
                 <w:szCs w:val="22"/>
-                <w:highlight w:val="yellow"/>
               </w:rPr>
             </w:pPr>
             <w:r>
               <w:rPr>
                 <w:sz w:val="22"/>
                 <w:szCs w:val="22"/>
-                <w:highlight w:val="yellow"/>
               </w:rPr>
               <w:t>Rs.0/-</w:t>
             </w:r>
@@ -3742,14 +3709,12 @@
               <w:rPr>
                 <w:sz w:val="22"/>
                 <w:szCs w:val="22"/>
-                <w:highlight w:val="yellow"/>
               </w:rPr>
             </w:pPr>
             <w:r>
               <w:rPr>
                 <w:sz w:val="22"/>
                 <w:szCs w:val="22"/>
-                <w:highlight w:val="yellow"/>
               </w:rPr>
               <w:t>30% - 39%</w:t>
             </w:r>
@@ -3769,14 +3734,12 @@
               <w:rPr>
                 <w:sz w:val="22"/>
                 <w:szCs w:val="22"/>
-                <w:highlight w:val="yellow"/>
               </w:rPr>
             </w:pPr>
             <w:r>
               <w:rPr>
                 <w:sz w:val="22"/>
                 <w:szCs w:val="22"/>
-                <w:highlight w:val="yellow"/>
               </w:rPr>
               <w:t>Rs. 10,000/- per month</w:t>
             </w:r>
@@ -3793,14 +3756,12 @@
               <w:rPr>
                 <w:sz w:val="22"/>
                 <w:szCs w:val="22"/>
-                <w:highlight w:val="yellow"/>
               </w:rPr>
             </w:pPr>
             <w:r>
               <w:rPr>
                 <w:sz w:val="22"/>
                 <w:szCs w:val="22"/>
-                <w:highlight w:val="yellow"/>
               </w:rPr>
               <w:t>+GST</w:t>
             </w:r>
@@ -3824,14 +3785,12 @@
               <w:rPr>
                 <w:sz w:val="22"/>
                 <w:szCs w:val="22"/>
-                <w:highlight w:val="yellow"/>
               </w:rPr>
             </w:pPr>
             <w:r>
               <w:rPr>
                 <w:sz w:val="22"/>
                 <w:szCs w:val="22"/>
-                <w:highlight w:val="yellow"/>
               </w:rPr>
               <w:t>40% - above</w:t>
             </w:r>
@@ -3848,14 +3807,12 @@
               <w:rPr>
                 <w:sz w:val="22"/>
                 <w:szCs w:val="22"/>
-                <w:highlight w:val="yellow"/>
               </w:rPr>
             </w:pPr>
             <w:r>
               <w:rPr>
                 <w:sz w:val="22"/>
                 <w:szCs w:val="22"/>
-                <w:highlight w:val="yellow"/>
               </w:rPr>
               <w:t>Rs. 15,000/- per month</w:t>
             </w:r>
@@ -3875,7 +3832,6 @@
               <w:rPr>
                 <w:sz w:val="22"/>
                 <w:szCs w:val="22"/>
-                <w:highlight w:val="yellow"/>
               </w:rPr>
               <w:t>+GST</w:t>
             </w:r>
@@ -8168,7 +8124,6 @@
       <w:r>
         <w:rPr>
           <w:rFonts w:ascii="Times New Roman" w:hAnsi="Times New Roman" w:cs="Times New Roman"/>
-          <w:highlight w:val="yellow"/>
         </w:rPr>
         <w:t>GST_ADDRESS</w:t>
       </w:r>
@@ -8206,7 +8161,6 @@
       <w:r>
         <w:rPr>
           <w:rFonts w:ascii="Times New Roman" w:hAnsi="Times New Roman" w:cs="Times New Roman"/>
-          <w:highlight w:val="yellow"/>
         </w:rPr>
         <w:t>OWNER_NAME</w:t>
       </w:r>
@@ -9535,13 +9489,20 @@
                 <w:szCs w:val="22"/>
                 <w:lang w:val="en-GB"/>
               </w:rPr>
-              <w:t xml:space="preserve">Name: </w:t>
-            </w:r>
-            <w:r>
-              <w:rPr>
-                <w:sz w:val="22"/>
-                <w:szCs w:val="22"/>
-                <w:highlight w:val="yellow"/>
+              <w:t>Name</w:t>
+            </w:r>
+            <w:r>
+              <w:rPr>
+                <w:sz w:val="22"/>
+                <w:szCs w:val="22"/>
+                <w:lang w:val="en-GB"/>
+              </w:rPr>
+              <w:t xml:space="preserve">: </w:t>
+            </w:r>
+            <w:r>
+              <w:rPr>
+                <w:sz w:val="22"/>
+                <w:szCs w:val="22"/>
               </w:rPr>
               <w:t>OWNER_NAME</w:t>
             </w:r>
@@ -10249,7 +10210,6 @@
         <w:rPr>
           <w:sz w:val="22"/>
           <w:szCs w:val="22"/>
-          <w:highlight w:val="yellow"/>
         </w:rPr>
         <w:t>INVENTRY</w:t>
       </w:r>
@@ -10331,7 +10291,6 @@
         <w:rPr>
           <w:sz w:val="22"/>
           <w:szCs w:val="22"/>
-          <w:highlight w:val="yellow"/>
           <w:shd w:val="clear" w:color="auto" w:fill="FBFBFB"/>
         </w:rPr>
         <w:t>HOTEL_NAME</w:t>
@@ -10347,7 +10306,6 @@
         <w:rPr>
           <w:sz w:val="22"/>
           <w:szCs w:val="22"/>
-          <w:highlight w:val="yellow"/>
         </w:rPr>
         <w:t>HOTEL_ADDRESS</w:t>
       </w:r>
@@ -10376,7 +10334,6 @@
         <w:rPr>
           <w:sz w:val="21"/>
           <w:szCs w:val="21"/>
-          <w:highlight w:val="yellow"/>
         </w:rPr>
         <w:t>LAT_D</w:t>
       </w:r>
@@ -10408,7 +10365,6 @@
         <w:rPr>
           <w:sz w:val="22"/>
           <w:szCs w:val="22"/>
-          <w:highlight w:val="yellow"/>
         </w:rPr>
         <w:t>LONG_D</w:t>
       </w:r>
@@ -12477,11 +12433,22 @@
           <w:u w:val="single"/>
         </w:rPr>
       </w:pPr>
-      <w:r>
+    </w:p>
+    <w:p>
+      <w:pPr>
+        <w:pStyle w:val="NoSpacing"/>
+        <w:jc w:val="center"/>
         <w:rPr>
           <w:rFonts w:ascii="Times New Roman" w:hAnsi="Times New Roman" w:cs="Times New Roman"/>
           <w:u w:val="single"/>
         </w:rPr>
+      </w:pPr>
+      <w:r>
+        <w:rPr>
+          <w:rFonts w:ascii="Times New Roman" w:hAnsi="Times New Roman" w:cs="Times New Roman"/>
+          <w:u w:val="single"/>
+        </w:rPr>
+        <w:lastRenderedPageBreak/>
         <w:t xml:space="preserve">Brand Display </w:t>
       </w:r>
     </w:p>
@@ -12506,6 +12473,7 @@
       </w:pPr>
       <w:r>
         <w:rPr>
+          <w:noProof/>
           <w:sz w:val="22"/>
           <w:szCs w:val="22"/>
           <w:u w:val="single"/>
@@ -13219,6 +13187,7 @@
           <w:sz w:val="22"/>
           <w:szCs w:val="22"/>
         </w:rPr>
+        <w:lastRenderedPageBreak/>
         <w:t>Provision for placing soap and shampoo/ shower gel.</w:t>
       </w:r>
     </w:p>
@@ -13240,7 +13209,6 @@
           <w:sz w:val="22"/>
           <w:szCs w:val="22"/>
         </w:rPr>
-        <w:lastRenderedPageBreak/>
         <w:t>Provision of at least one dustbin with garbage liners.</w:t>
       </w:r>
     </w:p>
@@ -14940,6 +14908,7 @@
           <w:sz w:val="22"/>
           <w:szCs w:val="22"/>
         </w:rPr>
+        <w:lastRenderedPageBreak/>
         <w:t>Above are main highlights of our SOPs. The list may be amended from time to time. Fab may also suggest some additional changes depending on the property. </w:t>
       </w:r>
     </w:p>
@@ -14958,7 +14927,6 @@
           <w:szCs w:val="22"/>
           <w:u w:val="single"/>
         </w:rPr>
-        <w:lastRenderedPageBreak/>
         <w:t>FabHotels</w:t>
       </w:r>
       <w:proofErr w:type="spellEnd"/>
@@ -15938,6 +15906,7 @@
           <w:sz w:val="22"/>
           <w:szCs w:val="22"/>
         </w:rPr>
+        <w:lastRenderedPageBreak/>
         <w:t>Wi-Fi network to be renamed to “</w:t>
       </w:r>
       <w:proofErr w:type="spellStart"/>
@@ -16028,7 +15997,6 @@
           <w:sz w:val="22"/>
           <w:szCs w:val="22"/>
         </w:rPr>
-        <w:lastRenderedPageBreak/>
         <w:t>24x7 100% power backup enough to power all guest room electronics &amp; appliances. </w:t>
       </w:r>
     </w:p>
@@ -17735,6 +17703,7 @@
           <w:szCs w:val="22"/>
           <w:u w:val="single"/>
         </w:rPr>
+        <w:lastRenderedPageBreak/>
         <w:t>FabHotel</w:t>
       </w:r>
       <w:proofErr w:type="spellEnd"/>
@@ -18835,6 +18804,7 @@
           <w:sz w:val="22"/>
           <w:szCs w:val="22"/>
         </w:rPr>
+        <w:lastRenderedPageBreak/>
         <w:t>Elevator (connected to power backup) for hotels which are greater than G+1 floors.</w:t>
       </w:r>
     </w:p>
@@ -18898,7 +18868,6 @@
           <w:sz w:val="22"/>
           <w:szCs w:val="22"/>
         </w:rPr>
-        <w:lastRenderedPageBreak/>
         <w:t>Common areas free of any smell. Use of lemon-grass aroma oil diffuser where necessary.</w:t>
       </w:r>
     </w:p>
@@ -25335,14 +25304,21 @@
           <w:sz w:val="21"/>
           <w:szCs w:val="21"/>
         </w:rPr>
-        <w:t xml:space="preserve">Date: </w:t>
+        <w:t>Date</w:t>
       </w:r>
       <w:r>
         <w:rPr>
           <w:rFonts w:ascii="Times New Roman" w:hAnsi="Times New Roman"/>
           <w:sz w:val="21"/>
           <w:szCs w:val="21"/>
-          <w:highlight w:val="yellow"/>
+        </w:rPr>
+        <w:t xml:space="preserve">: </w:t>
+      </w:r>
+      <w:r>
+        <w:rPr>
+          <w:rFonts w:ascii="Times New Roman" w:hAnsi="Times New Roman"/>
+          <w:sz w:val="21"/>
+          <w:szCs w:val="21"/>
         </w:rPr>
         <w:t>DATE</w:t>
       </w:r>
@@ -25414,7 +25390,6 @@
           <w:rFonts w:ascii="Times New Roman" w:hAnsi="Times New Roman"/>
           <w:sz w:val="21"/>
           <w:szCs w:val="21"/>
-          <w:highlight w:val="yellow"/>
         </w:rPr>
         <w:t>OWNER_NAME</w:t>
       </w:r>
@@ -25446,7 +25421,6 @@
         <w:rPr>
           <w:sz w:val="22"/>
           <w:szCs w:val="22"/>
-          <w:highlight w:val="yellow"/>
           <w:shd w:val="clear" w:color="auto" w:fill="FBFBFB"/>
         </w:rPr>
         <w:t>HOTEL_NAME</w:t>
@@ -25799,6 +25773,14 @@
               </w:rPr>
               <w:t>Website: www.fabhotels.com</w:t>
             </w:r>
+            <w:r>
+              <w:rPr>
+                <w:rFonts w:ascii="Times New Roman" w:hAnsi="Times New Roman" w:cs="Times New Roman"/>
+                <w:sz w:val="21"/>
+                <w:szCs w:val="21"/>
+              </w:rPr>
+              <w:t>ss</w:t>
+            </w:r>
           </w:p>
         </w:tc>
         <w:tc>
@@ -25824,7 +25806,6 @@
             </w:r>
             <w:r>
               <w:rPr>
-                <w:highlight w:val="yellow"/>
                 <w:shd w:val="clear" w:color="auto" w:fill="FBFBFB"/>
               </w:rPr>
               <w:t>HOTEL_NAME</w:t>
@@ -25856,7 +25837,6 @@
               <w:rPr>
                 <w:sz w:val="22"/>
                 <w:szCs w:val="22"/>
-                <w:highlight w:val="yellow"/>
               </w:rPr>
               <w:t>HOTEL_ADDRESS</w:t>
             </w:r>
@@ -25895,7 +25875,6 @@
               <w:rPr>
                 <w:sz w:val="21"/>
                 <w:szCs w:val="21"/>
-                <w:highlight w:val="yellow"/>
               </w:rPr>
               <w:t>OWNER_NAME</w:t>
             </w:r>
@@ -25910,7 +25889,6 @@
               <w:rPr>
                 <w:sz w:val="21"/>
                 <w:szCs w:val="21"/>
-                <w:highlight w:val="yellow"/>
               </w:rPr>
               <w:t>TRADE_NAME</w:t>
             </w:r>
@@ -25958,7 +25936,6 @@
               <w:rPr>
                 <w:sz w:val="21"/>
                 <w:szCs w:val="21"/>
-                <w:highlight w:val="yellow"/>
               </w:rPr>
               <w:t>OWNER_NAME</w:t>
             </w:r>
@@ -25981,7 +25958,6 @@
               <w:rPr>
                 <w:sz w:val="21"/>
                 <w:szCs w:val="21"/>
-                <w:highlight w:val="yellow"/>
               </w:rPr>
               <w:t>MOBILE_NO</w:t>
             </w:r>
@@ -26017,7 +25993,6 @@
                 <w:rFonts w:ascii="Times New Roman" w:hAnsi="Times New Roman" w:cs="Times New Roman"/>
                 <w:sz w:val="21"/>
                 <w:szCs w:val="21"/>
-                <w:highlight w:val="yellow"/>
               </w:rPr>
               <w:t>LANDLINE_NO</w:t>
             </w:r>
@@ -26040,7 +26015,6 @@
               <w:rPr>
                 <w:sz w:val="21"/>
                 <w:szCs w:val="21"/>
-                <w:highlight w:val="yellow"/>
               </w:rPr>
               <w:t>EMAIL_ADD</w:t>
             </w:r>
@@ -26085,7 +26059,6 @@
               <w:rPr>
                 <w:sz w:val="21"/>
                 <w:szCs w:val="21"/>
-                <w:highlight w:val="yellow"/>
               </w:rPr>
               <w:t>LAT_D</w:t>
             </w:r>
@@ -26111,7 +26084,6 @@
               <w:rPr>
                 <w:sz w:val="22"/>
                 <w:szCs w:val="22"/>
-                <w:highlight w:val="yellow"/>
               </w:rPr>
               <w:t>LONG_D</w:t>
             </w:r>
@@ -26197,7 +26169,6 @@
         <w:rPr>
           <w:sz w:val="22"/>
           <w:szCs w:val="22"/>
-          <w:highlight w:val="yellow"/>
         </w:rPr>
         <w:t>OWNER_NAME</w:t>
       </w:r>
@@ -26264,7 +26235,6 @@
         <w:rPr>
           <w:sz w:val="22"/>
           <w:szCs w:val="22"/>
-          <w:highlight w:val="yellow"/>
         </w:rPr>
         <w:t>DATE</w:t>
       </w:r>
@@ -34543,6 +34513,7 @@
   <w:style w:type="character" w:default="1" w:styleId="DefaultParagraphFont">
     <w:name w:val="Default Paragraph Font"/>
     <w:uiPriority w:val="1"/>
+    <w:semiHidden/>
     <w:unhideWhenUsed/>
   </w:style>
   <w:style w:type="table" w:default="1" w:styleId="TableNormal">

</xml_diff>